<commit_message>
Añado p6spy para probar
</commit_message>
<xml_diff>
--- a/docs/Funcionalidades.docx
+++ b/docs/Funcionalidades.docx
@@ -29,6 +29,10 @@
         <w:t xml:space="preserve"> </w:t>
       </w:r>
       <w:r>
+        <w:rPr>
+          <w:noProof/>
+          <w:lang w:eastAsia="es-ES"/>
+        </w:rPr>
         <w:drawing>
           <wp:inline distT="0" distB="0" distL="0" distR="0" wp14:anchorId="37555142" wp14:editId="5F1B2891">
             <wp:extent cx="161925" cy="161925"/>
@@ -81,6 +85,10 @@
         <w:t xml:space="preserve">  </w:t>
       </w:r>
       <w:r>
+        <w:rPr>
+          <w:noProof/>
+          <w:lang w:eastAsia="es-ES"/>
+        </w:rPr>
         <w:drawing>
           <wp:inline distT="0" distB="0" distL="0" distR="0" wp14:anchorId="637FCF60" wp14:editId="39437A8B">
             <wp:extent cx="161925" cy="161925"/>
@@ -133,6 +141,10 @@
         <w:t xml:space="preserve">   </w:t>
       </w:r>
       <w:r>
+        <w:rPr>
+          <w:noProof/>
+          <w:lang w:eastAsia="es-ES"/>
+        </w:rPr>
         <w:drawing>
           <wp:inline distT="0" distB="0" distL="0" distR="0" wp14:anchorId="637FCF60" wp14:editId="39437A8B">
             <wp:extent cx="161925" cy="161925"/>
@@ -185,6 +197,10 @@
         <w:t xml:space="preserve">  </w:t>
       </w:r>
       <w:r>
+        <w:rPr>
+          <w:noProof/>
+          <w:lang w:eastAsia="es-ES"/>
+        </w:rPr>
         <w:drawing>
           <wp:inline distT="0" distB="0" distL="0" distR="0" wp14:anchorId="637FCF60" wp14:editId="39437A8B">
             <wp:extent cx="161925" cy="161925"/>
@@ -225,6 +241,61 @@
     <w:p>
       <w:pPr>
         <w:pStyle w:val="Prrafodelista"/>
+        <w:numPr>
+          <w:ilvl w:val="0"/>
+          <w:numId w:val="2"/>
+        </w:numPr>
+      </w:pPr>
+      <w:r>
+        <w:t xml:space="preserve">Menú  </w:t>
+      </w:r>
+      <w:r>
+        <w:rPr>
+          <w:noProof/>
+          <w:lang w:eastAsia="es-ES"/>
+        </w:rPr>
+        <w:drawing>
+          <wp:inline distT="0" distB="0" distL="0" distR="0" wp14:anchorId="0813DE00" wp14:editId="7D38482A">
+            <wp:extent cx="161925" cy="161925"/>
+            <wp:effectExtent l="0" t="0" r="9525" b="9525"/>
+            <wp:docPr id="14" name="Imagen 14"/>
+            <wp:cNvGraphicFramePr>
+              <a:graphicFrameLocks xmlns:a="http://schemas.openxmlformats.org/drawingml/2006/main" noChangeAspect="1"/>
+            </wp:cNvGraphicFramePr>
+            <a:graphic xmlns:a="http://schemas.openxmlformats.org/drawingml/2006/main">
+              <a:graphicData uri="http://schemas.openxmlformats.org/drawingml/2006/picture">
+                <pic:pic xmlns:pic="http://schemas.openxmlformats.org/drawingml/2006/picture">
+                  <pic:nvPicPr>
+                    <pic:cNvPr id="1" name=""/>
+                    <pic:cNvPicPr/>
+                  </pic:nvPicPr>
+                  <pic:blipFill>
+                    <a:blip r:embed="rId5"/>
+                    <a:stretch>
+                      <a:fillRect/>
+                    </a:stretch>
+                  </pic:blipFill>
+                  <pic:spPr>
+                    <a:xfrm>
+                      <a:off x="0" y="0"/>
+                      <a:ext cx="161951" cy="161951"/>
+                    </a:xfrm>
+                    <a:prstGeom prst="rect">
+                      <a:avLst/>
+                    </a:prstGeom>
+                  </pic:spPr>
+                </pic:pic>
+              </a:graphicData>
+            </a:graphic>
+          </wp:inline>
+        </w:drawing>
+      </w:r>
+      <w:bookmarkStart w:id="0" w:name="_GoBack"/>
+      <w:bookmarkEnd w:id="0"/>
+    </w:p>
+    <w:p>
+      <w:pPr>
+        <w:pStyle w:val="Prrafodelista"/>
         <w:ind w:left="1440"/>
       </w:pPr>
     </w:p>
@@ -249,15 +320,13 @@
         </w:numPr>
       </w:pPr>
       <w:r>
-        <w:t>Listado usuarios</w:t>
-      </w:r>
-      <w:r>
-        <w:t xml:space="preserve"> por comunidad</w:t>
-      </w:r>
-      <w:r>
-        <w:t xml:space="preserve"> </w:t>
-      </w:r>
-      <w:r>
+        <w:t xml:space="preserve">Listado usuarios por comunidad </w:t>
+      </w:r>
+      <w:r>
+        <w:rPr>
+          <w:noProof/>
+          <w:lang w:eastAsia="es-ES"/>
+        </w:rPr>
         <w:drawing>
           <wp:inline distT="0" distB="0" distL="0" distR="0" wp14:anchorId="0D83BA89" wp14:editId="1197E11B">
             <wp:extent cx="161925" cy="161925"/>
@@ -307,6 +376,10 @@
         <w:t xml:space="preserve">Nueva  </w:t>
       </w:r>
       <w:r>
+        <w:rPr>
+          <w:noProof/>
+          <w:lang w:eastAsia="es-ES"/>
+        </w:rPr>
         <w:drawing>
           <wp:inline distT="0" distB="0" distL="0" distR="0" wp14:anchorId="0B0EF1ED" wp14:editId="5763CF10">
             <wp:extent cx="161925" cy="161925"/>
@@ -356,6 +429,10 @@
         <w:t xml:space="preserve">Editar   </w:t>
       </w:r>
       <w:r>
+        <w:rPr>
+          <w:noProof/>
+          <w:lang w:eastAsia="es-ES"/>
+        </w:rPr>
         <w:drawing>
           <wp:inline distT="0" distB="0" distL="0" distR="0" wp14:anchorId="2B0B7AF8" wp14:editId="727953FB">
             <wp:extent cx="161925" cy="161925"/>
@@ -405,6 +482,10 @@
         <w:t xml:space="preserve">Borrar  </w:t>
       </w:r>
       <w:r>
+        <w:rPr>
+          <w:noProof/>
+          <w:lang w:eastAsia="es-ES"/>
+        </w:rPr>
         <w:drawing>
           <wp:inline distT="0" distB="0" distL="0" distR="0" wp14:anchorId="3397C6DC" wp14:editId="60B4B75E">
             <wp:extent cx="161925" cy="161925"/>
@@ -469,15 +550,13 @@
         </w:numPr>
       </w:pPr>
       <w:r>
-        <w:t>Listado recursos</w:t>
-      </w:r>
-      <w:r>
-        <w:t xml:space="preserve"> por comunidad</w:t>
-      </w:r>
-      <w:r>
-        <w:t xml:space="preserve"> </w:t>
-      </w:r>
-      <w:r>
+        <w:t xml:space="preserve">Listado recursos por comunidad </w:t>
+      </w:r>
+      <w:r>
+        <w:rPr>
+          <w:noProof/>
+          <w:lang w:eastAsia="es-ES"/>
+        </w:rPr>
         <w:drawing>
           <wp:inline distT="0" distB="0" distL="0" distR="0" wp14:anchorId="47C0E18B" wp14:editId="4D997E4B">
             <wp:extent cx="161925" cy="161925"/>
@@ -524,15 +603,13 @@
         </w:numPr>
       </w:pPr>
       <w:r>
-        <w:t>Nuev</w:t>
-      </w:r>
-      <w:r>
-        <w:t>o</w:t>
-      </w:r>
-      <w:r>
-        <w:t xml:space="preserve">  </w:t>
-      </w:r>
-      <w:r>
+        <w:t xml:space="preserve">Nuevo  </w:t>
+      </w:r>
+      <w:r>
+        <w:rPr>
+          <w:noProof/>
+          <w:lang w:eastAsia="es-ES"/>
+        </w:rPr>
         <w:drawing>
           <wp:inline distT="0" distB="0" distL="0" distR="0" wp14:anchorId="0B0EF1ED" wp14:editId="5763CF10">
             <wp:extent cx="161925" cy="161925"/>
@@ -582,6 +659,10 @@
         <w:t xml:space="preserve">Editar   </w:t>
       </w:r>
       <w:r>
+        <w:rPr>
+          <w:noProof/>
+          <w:lang w:eastAsia="es-ES"/>
+        </w:rPr>
         <w:drawing>
           <wp:inline distT="0" distB="0" distL="0" distR="0" wp14:anchorId="2B0B7AF8" wp14:editId="727953FB">
             <wp:extent cx="161925" cy="161925"/>
@@ -631,6 +712,10 @@
         <w:t xml:space="preserve">Borrar  </w:t>
       </w:r>
       <w:r>
+        <w:rPr>
+          <w:noProof/>
+          <w:lang w:eastAsia="es-ES"/>
+        </w:rPr>
         <w:drawing>
           <wp:inline distT="0" distB="0" distL="0" distR="0" wp14:anchorId="3397C6DC" wp14:editId="60B4B75E">
             <wp:extent cx="161925" cy="161925"/>
@@ -707,6 +792,10 @@
         <w:t xml:space="preserve">  </w:t>
       </w:r>
       <w:r>
+        <w:rPr>
+          <w:noProof/>
+          <w:lang w:eastAsia="es-ES"/>
+        </w:rPr>
         <w:drawing>
           <wp:inline distT="0" distB="0" distL="0" distR="0" wp14:anchorId="032FDA62" wp14:editId="5DD982CB">
             <wp:extent cx="161925" cy="161925"/>
@@ -759,11 +848,15 @@
         <w:t xml:space="preserve"> </w:t>
       </w:r>
       <w:r>
+        <w:rPr>
+          <w:noProof/>
+          <w:lang w:eastAsia="es-ES"/>
+        </w:rPr>
         <w:drawing>
-          <wp:inline distT="0" distB="0" distL="0" distR="0" wp14:anchorId="39FC4FC8" wp14:editId="1F8D6DBF">
-            <wp:extent cx="171450" cy="167927"/>
-            <wp:effectExtent l="0" t="0" r="0" b="3810"/>
-            <wp:docPr id="19" name="Imagen 19"/>
+          <wp:inline distT="0" distB="0" distL="0" distR="0" wp14:anchorId="035365BE" wp14:editId="3172DD47">
+            <wp:extent cx="161925" cy="161925"/>
+            <wp:effectExtent l="0" t="0" r="9525" b="9525"/>
+            <wp:docPr id="1" name="Imagen 1"/>
             <wp:cNvGraphicFramePr>
               <a:graphicFrameLocks xmlns:a="http://schemas.openxmlformats.org/drawingml/2006/main" noChangeAspect="1"/>
             </wp:cNvGraphicFramePr>
@@ -775,7 +868,7 @@
                     <pic:cNvPicPr/>
                   </pic:nvPicPr>
                   <pic:blipFill>
-                    <a:blip r:embed="rId6"/>
+                    <a:blip r:embed="rId5"/>
                     <a:stretch>
                       <a:fillRect/>
                     </a:stretch>
@@ -783,7 +876,7 @@
                   <pic:spPr>
                     <a:xfrm>
                       <a:off x="0" y="0"/>
-                      <a:ext cx="171450" cy="167927"/>
+                      <a:ext cx="161951" cy="161951"/>
                     </a:xfrm>
                     <a:prstGeom prst="rect">
                       <a:avLst/>
@@ -808,6 +901,10 @@
         <w:t xml:space="preserve">Borrar  </w:t>
       </w:r>
       <w:r>
+        <w:rPr>
+          <w:noProof/>
+          <w:lang w:eastAsia="es-ES"/>
+        </w:rPr>
         <w:drawing>
           <wp:inline distT="0" distB="0" distL="0" distR="0" wp14:anchorId="561AF63C" wp14:editId="636550C2">
             <wp:extent cx="161925" cy="161925"/>
@@ -844,14 +941,16 @@
           </wp:inline>
         </w:drawing>
       </w:r>
-      <w:bookmarkStart w:id="0" w:name="_GoBack"/>
-      <w:bookmarkEnd w:id="0"/>
     </w:p>
     <w:p/>
     <w:p/>
     <w:p/>
     <w:p>
       <w:r>
+        <w:rPr>
+          <w:noProof/>
+          <w:lang w:eastAsia="es-ES"/>
+        </w:rPr>
         <w:drawing>
           <wp:inline distT="0" distB="0" distL="0" distR="0" wp14:anchorId="32A3E873" wp14:editId="55194FD4">
             <wp:extent cx="171450" cy="167927"/>

</xml_diff>